<commit_message>
corrected the combination names
</commit_message>
<xml_diff>
--- a/backend-exhibits/Box to Google MyDrive Standard Plan - Standard Not Include.docx
+++ b/backend-exhibits/Box to Google MyDrive Standard Plan - Standard Not Include.docx
@@ -46,9 +46,7 @@
             </w:pPr>
             <w:r>
               <w:rPr>
-                <w:rFonts w:ascii="Arial" w:hAnsi="Arial" w:cs="Arial" w:eastAsia="Arial"/>
                 <w:b/>
-                <w:sz w:val="21"/>
               </w:rPr>
               <w:t>NOT INCLUDED IN BOX TO GOOGLE MYDRIVE MIGRATION FEATURES</w:t>
             </w:r>
@@ -75,9 +73,7 @@
             </w:pPr>
             <w:r>
               <w:rPr>
-                <w:rFonts w:ascii="Arial" w:hAnsi="Arial" w:cs="Arial" w:eastAsia="Arial"/>
                 <w:b/>
-                <w:sz w:val="21"/>
               </w:rPr>
               <w:t xml:space="preserve">Selective </w:t>
             </w:r>
@@ -88,9 +84,7 @@
             </w:pPr>
             <w:r>
               <w:rPr>
-                <w:rFonts w:ascii="Arial" w:hAnsi="Arial" w:cs="Arial" w:eastAsia="Arial"/>
                 <w:b/>
-                <w:sz w:val="21"/>
               </w:rPr>
               <w:t>Versions</w:t>
             </w:r>
@@ -108,10 +102,6 @@
           </w:tcPr>
           <w:p>
             <w:r>
-              <w:rPr>
-                <w:rFonts w:ascii="Arial" w:hAnsi="Arial" w:cs="Arial" w:eastAsia="Arial"/>
-                <w:sz w:val="21"/>
-              </w:rPr>
               <w:t>Migration of selective versions of files from source to destination. If we opt for five, the last five versions will get migrates to the destination.</w:t>
             </w:r>
           </w:p>
@@ -137,9 +127,7 @@
             </w:pPr>
             <w:r>
               <w:rPr>
-                <w:rFonts w:ascii="Arial" w:hAnsi="Arial" w:cs="Arial" w:eastAsia="Arial"/>
                 <w:b/>
-                <w:sz w:val="21"/>
               </w:rPr>
               <w:t>Box Notes</w:t>
             </w:r>
@@ -157,10 +145,6 @@
           </w:tcPr>
           <w:p>
             <w:r>
-              <w:rPr>
-                <w:rFonts w:ascii="Arial" w:hAnsi="Arial" w:cs="Arial" w:eastAsia="Arial"/>
-                <w:sz w:val="21"/>
-              </w:rPr>
               <w:t>Migration of Box Notes files in the .DOCX format to the destination cloud.</w:t>
             </w:r>
           </w:p>
@@ -186,9 +170,7 @@
             </w:pPr>
             <w:r>
               <w:rPr>
-                <w:rFonts w:ascii="Arial" w:hAnsi="Arial" w:cs="Arial" w:eastAsia="Arial"/>
                 <w:b/>
-                <w:sz w:val="21"/>
               </w:rPr>
               <w:t>Embedded Links</w:t>
             </w:r>
@@ -206,10 +188,6 @@
           </w:tcPr>
           <w:p>
             <w:r>
-              <w:rPr>
-                <w:rFonts w:ascii="Arial" w:hAnsi="Arial" w:cs="Arial" w:eastAsia="Arial"/>
-                <w:sz w:val="21"/>
-              </w:rPr>
               <w:t>The system retains the addresses of links present within a file, which point to other files in the cloud. These links' addresses will be transformed into appropriate destination formats during Migration.</w:t>
             </w:r>
           </w:p>
@@ -221,216 +199,6 @@
         <w:br/>
       </w:r>
     </w:p>
-    <w:tbl>
-      <w:tblPr>
-        <w:tblStyle w:val="TableGrid"/>
-        <w:tblW w:w="10721" w:type="dxa"/>
-        <w:tblInd w:w="-681" w:type="dxa"/>
-        <w:tblCellMar>
-          <w:top w:w="108" w:type="dxa"/>
-          <w:left w:w="64" w:type="dxa"/>
-          <w:right w:w="10" w:type="dxa"/>
-        </w:tblCellMar>
-        <w:tblLook w:val="04A0" w:firstRow="1" w:lastRow="0" w:firstColumn="1" w:lastColumn="0" w:noHBand="0" w:noVBand="1"/>
-      </w:tblPr>
-      <w:tblGrid>
-        <w:gridCol w:w="2658"/>
-        <w:gridCol w:w="8063"/>
-      </w:tblGrid>
-      <w:tr>
-        <w:trPr>
-          <w:trHeight w:val="401"/>
-        </w:trPr>
-        <w:tc>
-          <w:tcPr>
-            <w:tcW w:w="10721" w:type="dxa"/>
-            <w:gridSpan w:val="2"/>
-            <w:tcBorders>
-              <w:top w:val="single" w:sz="6" w:space="0" w:color="666666"/>
-              <w:left w:val="single" w:sz="6" w:space="0" w:color="666666"/>
-              <w:bottom w:val="single" w:sz="6" w:space="0" w:color="666666"/>
-              <w:right w:val="single" w:sz="6" w:space="0" w:color="666666"/>
-            </w:tcBorders>
-            <w:shd w:val="clear" w:color="auto" w:fill="A6A6A6"/>
-          </w:tcPr>
-          <w:p>
-            <w:pPr>
-              <w:ind w:right="55"/>
-              <w:jc w:val="center"/>
-            </w:pPr>
-            <w:r>
-              <w:rPr>
-                <w:rFonts w:ascii="Arial" w:hAnsi="Arial" w:cs="Arial" w:eastAsia="Arial"/>
-                <w:b/>
-                <w:sz w:val="21"/>
-              </w:rPr>
-              <w:t>NOT INCLUDED IN BOX TO GOOGLE SHARED DRIVE MIGRATION FEATURES</w:t>
-            </w:r>
-          </w:p>
-        </w:tc>
-      </w:tr>
-      <w:tr>
-        <w:trPr>
-          <w:trHeight w:val="662"/>
-        </w:trPr>
-        <w:tc>
-          <w:tcPr>
-            <w:tcW w:w="2658" w:type="dxa"/>
-            <w:tcBorders>
-              <w:top w:val="single" w:sz="6" w:space="0" w:color="666666"/>
-              <w:left w:val="single" w:sz="6" w:space="0" w:color="666666"/>
-              <w:bottom w:val="single" w:sz="6" w:space="0" w:color="666666"/>
-              <w:right w:val="single" w:sz="6" w:space="0" w:color="666666"/>
-            </w:tcBorders>
-          </w:tcPr>
-          <w:p>
-            <w:pPr>
-              <w:ind w:left="1"/>
-            </w:pPr>
-            <w:r>
-              <w:rPr>
-                <w:rFonts w:ascii="Arial" w:hAnsi="Arial" w:cs="Arial" w:eastAsia="Arial"/>
-                <w:b/>
-                <w:sz w:val="21"/>
-              </w:rPr>
-              <w:t xml:space="preserve">Selective </w:t>
-            </w:r>
-          </w:p>
-          <w:p>
-            <w:pPr>
-              <w:ind w:left="1"/>
-            </w:pPr>
-            <w:r>
-              <w:rPr>
-                <w:rFonts w:ascii="Arial" w:hAnsi="Arial" w:cs="Arial" w:eastAsia="Arial"/>
-                <w:b/>
-                <w:sz w:val="21"/>
-              </w:rPr>
-              <w:t>Versions</w:t>
-            </w:r>
-          </w:p>
-        </w:tc>
-        <w:tc>
-          <w:tcPr>
-            <w:tcW w:w="8063" w:type="dxa"/>
-            <w:tcBorders>
-              <w:top w:val="single" w:sz="6" w:space="0" w:color="666666"/>
-              <w:left w:val="single" w:sz="6" w:space="0" w:color="666666"/>
-              <w:bottom w:val="single" w:sz="6" w:space="0" w:color="666666"/>
-              <w:right w:val="single" w:sz="6" w:space="0" w:color="666666"/>
-            </w:tcBorders>
-          </w:tcPr>
-          <w:p>
-            <w:r>
-              <w:rPr>
-                <w:rFonts w:ascii="Arial" w:hAnsi="Arial" w:cs="Arial" w:eastAsia="Arial"/>
-                <w:sz w:val="21"/>
-              </w:rPr>
-              <w:t>Migration of selective versions of files from source to destination. If we opt for five, the last five versions will get migrates to the destination.</w:t>
-            </w:r>
-          </w:p>
-        </w:tc>
-      </w:tr>
-      <w:tr>
-        <w:trPr>
-          <w:trHeight w:val="390"/>
-        </w:trPr>
-        <w:tc>
-          <w:tcPr>
-            <w:tcW w:w="2658" w:type="dxa"/>
-            <w:tcBorders>
-              <w:top w:val="single" w:sz="6" w:space="0" w:color="666666"/>
-              <w:left w:val="single" w:sz="6" w:space="0" w:color="666666"/>
-              <w:bottom w:val="single" w:sz="6" w:space="0" w:color="666666"/>
-              <w:right w:val="single" w:sz="6" w:space="0" w:color="666666"/>
-            </w:tcBorders>
-          </w:tcPr>
-          <w:p>
-            <w:pPr>
-              <w:ind w:left="1"/>
-            </w:pPr>
-            <w:r>
-              <w:rPr>
-                <w:rFonts w:ascii="Arial" w:hAnsi="Arial" w:cs="Arial" w:eastAsia="Arial"/>
-                <w:b/>
-                <w:sz w:val="21"/>
-              </w:rPr>
-              <w:t>Box Notes</w:t>
-            </w:r>
-          </w:p>
-        </w:tc>
-        <w:tc>
-          <w:tcPr>
-            <w:tcW w:w="8063" w:type="dxa"/>
-            <w:tcBorders>
-              <w:top w:val="single" w:sz="6" w:space="0" w:color="666666"/>
-              <w:left w:val="single" w:sz="6" w:space="0" w:color="666666"/>
-              <w:bottom w:val="single" w:sz="6" w:space="0" w:color="666666"/>
-              <w:right w:val="single" w:sz="6" w:space="0" w:color="666666"/>
-            </w:tcBorders>
-          </w:tcPr>
-          <w:p>
-            <w:r>
-              <w:rPr>
-                <w:rFonts w:ascii="Arial" w:hAnsi="Arial" w:cs="Arial" w:eastAsia="Arial"/>
-                <w:sz w:val="21"/>
-              </w:rPr>
-              <w:t>Migration of Box Notes files in the .DOCX format to the destination cloud.</w:t>
-            </w:r>
-          </w:p>
-        </w:tc>
-      </w:tr>
-      <w:tr>
-        <w:trPr>
-          <w:trHeight w:val="930"/>
-        </w:trPr>
-        <w:tc>
-          <w:tcPr>
-            <w:tcW w:w="2658" w:type="dxa"/>
-            <w:tcBorders>
-              <w:top w:val="single" w:sz="6" w:space="0" w:color="666666"/>
-              <w:left w:val="single" w:sz="6" w:space="0" w:color="666666"/>
-              <w:bottom w:val="single" w:sz="6" w:space="0" w:color="666666"/>
-              <w:right w:val="single" w:sz="6" w:space="0" w:color="666666"/>
-            </w:tcBorders>
-          </w:tcPr>
-          <w:p>
-            <w:pPr>
-              <w:ind w:left="1"/>
-              <w:jc w:val="both"/>
-            </w:pPr>
-            <w:r>
-              <w:rPr>
-                <w:rFonts w:ascii="Arial" w:hAnsi="Arial" w:cs="Arial" w:eastAsia="Arial"/>
-                <w:b/>
-                <w:sz w:val="21"/>
-              </w:rPr>
-              <w:t>Embedded Links</w:t>
-            </w:r>
-          </w:p>
-        </w:tc>
-        <w:tc>
-          <w:tcPr>
-            <w:tcW w:w="8063" w:type="dxa"/>
-            <w:tcBorders>
-              <w:top w:val="single" w:sz="6" w:space="0" w:color="666666"/>
-              <w:left w:val="single" w:sz="6" w:space="0" w:color="666666"/>
-              <w:bottom w:val="single" w:sz="6" w:space="0" w:color="666666"/>
-              <w:right w:val="single" w:sz="6" w:space="0" w:color="666666"/>
-            </w:tcBorders>
-          </w:tcPr>
-          <w:p>
-            <w:r>
-              <w:rPr>
-                <w:rFonts w:ascii="Arial" w:hAnsi="Arial" w:cs="Arial" w:eastAsia="Arial"/>
-                <w:sz w:val="21"/>
-              </w:rPr>
-              <w:t>The system retains the addresses of links present within a file, which point to other files in the cloud. These links' addresses will be transformed into appropriate destination formats during Migration.</w:t>
-            </w:r>
-          </w:p>
-        </w:tc>
-      </w:tr>
-    </w:tbl>
     <w:p/>
     <w:sectPr>
       <w:pgSz w:w="12240" w:h="15840"/>
@@ -446,7 +214,7 @@
   <w:docDefaults>
     <w:rPrDefault>
       <w:rPr>
-        <w:rFonts w:ascii="Arial" w:hAnsi="Arial" w:cs="Arial" w:eastAsia="Arial"/>
+        <w:rFonts w:ascii="Arial" w:eastAsia="Arial" w:hAnsi="Arial" w:cs="Arial"/>
         <w:kern w:val="2"/>
         <w:sz w:val="21"/>
         <w:szCs w:val="21"/>
@@ -845,9 +613,7 @@
       <w:spacing w:line="259" w:lineRule="auto"/>
     </w:pPr>
     <w:rPr>
-      <w:rFonts w:ascii="Arial" w:hAnsi="Arial" w:cs="Arial" w:eastAsia="Arial"/>
       <w:color w:val="000000"/>
-      <w:sz w:val="21"/>
     </w:rPr>
   </w:style>
   <w:style w:type="character" w:default="1" w:styleId="DefaultParagraphFont">

</xml_diff>